<commit_message>
feat: add RevealJS slide decks for all 8 Mathematical Fundamentals modules
- Create assets/dark-slides.scss (RevealJS-specific SCSS theme)
- Add module-1-slides.qmd through module-8-slides.qmd in
  teaching/mathematical-fundamentals/ (EN lecture slides)
- Add fr/teaching/mathematical-fundamentals/ with 8 French stub decks
- Update _quarto.yml: sidebar regrouped by module (Reference + Slides
  under each numbered section); fr-mathematical-fundamentals sidebar block;
  fr/**/*.qmd added to render glob
- Add lecture-slides blockquote link to each module-N.qmd reference page
- Render all 16 decks and full site (quarto render, exit 0)

Spec: specs/007-math-fundamentals-slides/
</commit_message>
<xml_diff>
--- a/docs/teaching/inseec-finance/exercices/examen-1h.docx
+++ b/docs/teaching/inseec-finance/exercices/examen-1h.docx
@@ -71,7 +71,7 @@
         <w:pStyle w:val="Date"/>
       </w:pPr>
       <w:r>
-        <w:t xml:space="preserve">2026-08-28</w:t>
+        <w:t xml:space="preserve">2026-09-15</w:t>
       </w:r>
     </w:p>
     <w:p>
@@ -79,7 +79,7 @@
         <w:pStyle w:val="AbstractTitle"/>
       </w:pPr>
       <w:r>
-        <w:t xml:space="preserve">Résumé</w:t>
+        <w:t xml:space="preserve">Abstract</w:t>
       </w:r>
     </w:p>
     <w:p>
@@ -6986,7 +6986,7 @@
         <w:rFonts w:asciiTheme="minorHAnsi" w:cstheme="minorBidi" w:eastAsiaTheme="minorHAnsi" w:hAnsiTheme="minorHAnsi"/>
         <w:sz w:val="24"/>
         <w:szCs w:val="24"/>
-        <w:lang w:bidi="ar-SA" w:eastAsia="en-US" w:val="fr"/>
+        <w:lang w:bidi="ar-SA" w:eastAsia="en-US" w:val="en-US"/>
       </w:rPr>
     </w:rPrDefault>
     <w:pPrDefault>

</xml_diff>